<commit_message>
Use the updated architecture and scaling figures in the submission document
Swaps Figure 2 to reports/technical_architecture_final.png and Figure 3 to
reports/scaling_chart_detailed.png. Both figures are colour, which differs
from the black-only rule applied to the rest of the document; this is at the
author's explicit request.

Verified the numbers in both against the repository before adopting them:
scaling times and alert counts match reports/scaling_measurements.json
exactly (0.140s/1,192, 0.535s/4,202, 1.021s/8,090, 2.493s/20,185), the
derived throughputs and the 49.9 ms per 1,000 events check out, and
ROC 0.988, PR-AUC 0.57 and the 5.2x baseline margin match metrics.json.

Also drops the measurements table that followed Figure 3, because the new
chart already contains it, and removes the dedicated page the previous tall
architecture render needed. 25 pages to 23.

Co-Authored-By: Claude Opus 4.8 <noreply@anthropic.com>
</commit_message>
<xml_diff>
--- a/outputs/Resilience_Graph_AI_Submission.docx
+++ b/outputs/Resilience_Graph_AI_Submission.docx
@@ -3740,11 +3740,6 @@
       </w:r>
     </w:p>
     <w:p>
-      <w:r>
-        <w:br w:type="page"/>
-      </w:r>
-    </w:p>
-    <w:p>
       <w:pPr>
         <w:spacing w:before="120" w:after="60"/>
         <w:jc w:val="center"/>
@@ -3752,7 +3747,7 @@
       <w:r>
         <w:drawing>
           <wp:inline xmlns:a="http://schemas.openxmlformats.org/drawingml/2006/main" xmlns:pic="http://schemas.openxmlformats.org/drawingml/2006/picture">
-            <wp:extent cx="5256000" cy="8964153"/>
+            <wp:extent cx="6120000" cy="3442500"/>
             <wp:docPr id="2" name="Picture 2"/>
             <wp:cNvGraphicFramePr>
               <a:graphicFrameLocks noChangeAspect="1"/>
@@ -3761,7 +3756,7 @@
               <a:graphicData uri="http://schemas.openxmlformats.org/drawingml/2006/picture">
                 <pic:pic>
                   <pic:nvPicPr>
-                    <pic:cNvPr id="0" name="architecture_bw.png"/>
+                    <pic:cNvPr id="0" name="technical_architecture_final.png"/>
                     <pic:cNvPicPr/>
                   </pic:nvPicPr>
                   <pic:blipFill>
@@ -3773,7 +3768,7 @@
                   <pic:spPr>
                     <a:xfrm>
                       <a:off x="0" y="0"/>
-                      <a:ext cx="5256000" cy="8964153"/>
+                      <a:ext cx="6120000" cy="3442500"/>
                     </a:xfrm>
                     <a:prstGeom prst="rect"/>
                   </pic:spPr>
@@ -3797,12 +3792,7 @@
           <w:color w:val="000000"/>
           <w:sz w:val="18"/>
         </w:rPr>
-        <w:t>Figure 2. Technical architecture. Frontend, backend, analysis spine, AI engines, persisted artifacts, offline build pipeline and deployment. A full resolution copy is in the repository at reports/technical_architecture.png.</w:t>
-      </w:r>
-    </w:p>
-    <w:p>
-      <w:r>
-        <w:br w:type="page"/>
+        <w:t>Figure 2. Technical architecture. Inputs, the single container runtime across four planes, and the outcomes delivered to a security team. A full resolution copy is in the repository at reports/technical_architecture_final.png.</w:t>
       </w:r>
     </w:p>
     <w:p>
@@ -12352,7 +12342,7 @@
       <w:r>
         <w:drawing>
           <wp:inline xmlns:a="http://schemas.openxmlformats.org/drawingml/2006/main" xmlns:pic="http://schemas.openxmlformats.org/drawingml/2006/picture">
-            <wp:extent cx="6120000" cy="2371328"/>
+            <wp:extent cx="6120000" cy="2754000"/>
             <wp:docPr id="3" name="Picture 3"/>
             <wp:cNvGraphicFramePr>
               <a:graphicFrameLocks noChangeAspect="1"/>
@@ -12361,7 +12351,7 @@
               <a:graphicData uri="http://schemas.openxmlformats.org/drawingml/2006/picture">
                 <pic:pic>
                   <pic:nvPicPr>
-                    <pic:cNvPr id="0" name="scaling_bw.png"/>
+                    <pic:cNvPr id="0" name="scaling_chart_detailed.png"/>
                     <pic:cNvPicPr/>
                   </pic:nvPicPr>
                   <pic:blipFill>
@@ -12373,7 +12363,7 @@
                   <pic:spPr>
                     <a:xfrm>
                       <a:off x="0" y="0"/>
-                      <a:ext cx="6120000" cy="2371328"/>
+                      <a:ext cx="6120000" cy="2754000"/>
                     </a:xfrm>
                     <a:prstGeom prst="rect"/>
                   </pic:spPr>
@@ -12397,374 +12387,8 @@
           <w:color w:val="000000"/>
           <w:sz w:val="18"/>
         </w:rPr>
-        <w:t>Figure 3. Measured end to end analysis time against input size.</w:t>
+        <w:t>Figure 3. Measured end to end analysis time against input size, with the measurement table and verification notes.</w:t>
       </w:r>
-    </w:p>
-    <w:tbl>
-      <w:tblPr>
-        <w:tblW w:type="auto" w:w="0"/>
-        <w:jc w:val="center"/>
-        <w:tblLayout w:type="fixed"/>
-        <w:tblLook w:firstColumn="1" w:firstRow="1" w:lastColumn="0" w:lastRow="0" w:noHBand="0" w:noVBand="1" w:val="04A0"/>
-        <w:tblBorders>
-          <w:top w:val="single" w:sz="8" w:space="0" w:color="000000"/>
-          <w:left w:val="single" w:sz="8" w:space="0" w:color="000000"/>
-          <w:bottom w:val="single" w:sz="8" w:space="0" w:color="000000"/>
-          <w:right w:val="single" w:sz="8" w:space="0" w:color="000000"/>
-          <w:insideH w:val="single" w:sz="8" w:space="0" w:color="000000"/>
-          <w:insideV w:val="single" w:sz="8" w:space="0" w:color="000000"/>
-        </w:tblBorders>
-      </w:tblPr>
-      <w:tblGrid>
-        <w:gridCol w:w="3213"/>
-        <w:gridCol w:w="3213"/>
-        <w:gridCol w:w="3213"/>
-      </w:tblGrid>
-      <w:tr>
-        <w:tc>
-          <w:tcPr>
-            <w:tcW w:type="dxa" w:w="3402"/>
-            <w:shd w:val="clear" w:color="auto" w:fill="FFFFFF"/>
-          </w:tcPr>
-          <w:p>
-            <w:pPr>
-              <w:spacing w:after="40" w:before="40" w:line="252" w:lineRule="auto"/>
-            </w:pPr>
-            <w:r/>
-            <w:r>
-              <w:rPr>
-                <w:rFonts w:ascii="Calibri" w:hAnsi="Calibri" w:eastAsia="Calibri"/>
-                <w:b/>
-                <w:i w:val="0"/>
-                <w:color w:val="000000"/>
-                <w:sz w:val="19"/>
-              </w:rPr>
-              <w:t>Events in one request</w:t>
-            </w:r>
-          </w:p>
-        </w:tc>
-        <w:tc>
-          <w:tcPr>
-            <w:tcW w:type="dxa" w:w="3118"/>
-            <w:shd w:val="clear" w:color="auto" w:fill="FFFFFF"/>
-          </w:tcPr>
-          <w:p>
-            <w:pPr>
-              <w:spacing w:after="40" w:before="40" w:line="252" w:lineRule="auto"/>
-            </w:pPr>
-            <w:r/>
-            <w:r>
-              <w:rPr>
-                <w:rFonts w:ascii="Calibri" w:hAnsi="Calibri" w:eastAsia="Calibri"/>
-                <w:b/>
-                <w:i w:val="0"/>
-                <w:color w:val="000000"/>
-                <w:sz w:val="19"/>
-              </w:rPr>
-              <w:t>End to end time</w:t>
-            </w:r>
-          </w:p>
-        </w:tc>
-        <w:tc>
-          <w:tcPr>
-            <w:tcW w:type="dxa" w:w="3118"/>
-            <w:shd w:val="clear" w:color="auto" w:fill="FFFFFF"/>
-          </w:tcPr>
-          <w:p>
-            <w:pPr>
-              <w:spacing w:after="40" w:before="40" w:line="252" w:lineRule="auto"/>
-            </w:pPr>
-            <w:r/>
-            <w:r>
-              <w:rPr>
-                <w:rFonts w:ascii="Calibri" w:hAnsi="Calibri" w:eastAsia="Calibri"/>
-                <w:b/>
-                <w:i w:val="0"/>
-                <w:color w:val="000000"/>
-                <w:sz w:val="19"/>
-              </w:rPr>
-              <w:t>Alerts raised</w:t>
-            </w:r>
-          </w:p>
-        </w:tc>
-      </w:tr>
-      <w:tr>
-        <w:tc>
-          <w:tcPr>
-            <w:tcW w:type="dxa" w:w="3402"/>
-            <w:shd w:val="clear" w:color="auto" w:fill="FFFFFF"/>
-          </w:tcPr>
-          <w:p>
-            <w:pPr>
-              <w:spacing w:after="40" w:before="40" w:line="252" w:lineRule="auto"/>
-            </w:pPr>
-            <w:r/>
-            <w:r>
-              <w:rPr>
-                <w:rFonts w:ascii="Calibri" w:hAnsi="Calibri" w:eastAsia="Calibri"/>
-                <w:b w:val="0"/>
-                <w:i w:val="0"/>
-                <w:color w:val="000000"/>
-                <w:sz w:val="19"/>
-              </w:rPr>
-              <w:t>2,732</w:t>
-            </w:r>
-          </w:p>
-        </w:tc>
-        <w:tc>
-          <w:tcPr>
-            <w:tcW w:type="dxa" w:w="3118"/>
-            <w:shd w:val="clear" w:color="auto" w:fill="FFFFFF"/>
-          </w:tcPr>
-          <w:p>
-            <w:pPr>
-              <w:spacing w:after="40" w:before="40" w:line="252" w:lineRule="auto"/>
-            </w:pPr>
-            <w:r/>
-            <w:r>
-              <w:rPr>
-                <w:rFonts w:ascii="Calibri" w:hAnsi="Calibri" w:eastAsia="Calibri"/>
-                <w:b w:val="0"/>
-                <w:i w:val="0"/>
-                <w:color w:val="000000"/>
-                <w:sz w:val="19"/>
-              </w:rPr>
-              <w:t>0.140 seconds</w:t>
-            </w:r>
-          </w:p>
-        </w:tc>
-        <w:tc>
-          <w:tcPr>
-            <w:tcW w:type="dxa" w:w="3118"/>
-            <w:shd w:val="clear" w:color="auto" w:fill="FFFFFF"/>
-          </w:tcPr>
-          <w:p>
-            <w:pPr>
-              <w:spacing w:after="40" w:before="40" w:line="252" w:lineRule="auto"/>
-            </w:pPr>
-            <w:r/>
-            <w:r>
-              <w:rPr>
-                <w:rFonts w:ascii="Calibri" w:hAnsi="Calibri" w:eastAsia="Calibri"/>
-                <w:b w:val="0"/>
-                <w:i w:val="0"/>
-                <w:color w:val="000000"/>
-                <w:sz w:val="19"/>
-              </w:rPr>
-              <w:t>1,192</w:t>
-            </w:r>
-          </w:p>
-        </w:tc>
-      </w:tr>
-      <w:tr>
-        <w:tc>
-          <w:tcPr>
-            <w:tcW w:type="dxa" w:w="3402"/>
-            <w:shd w:val="clear" w:color="auto" w:fill="FFFFFF"/>
-          </w:tcPr>
-          <w:p>
-            <w:pPr>
-              <w:spacing w:after="40" w:before="40" w:line="252" w:lineRule="auto"/>
-            </w:pPr>
-            <w:r/>
-            <w:r>
-              <w:rPr>
-                <w:rFonts w:ascii="Calibri" w:hAnsi="Calibri" w:eastAsia="Calibri"/>
-                <w:b w:val="0"/>
-                <w:i w:val="0"/>
-                <w:color w:val="000000"/>
-                <w:sz w:val="19"/>
-              </w:rPr>
-              <w:t>10,000</w:t>
-            </w:r>
-          </w:p>
-        </w:tc>
-        <w:tc>
-          <w:tcPr>
-            <w:tcW w:type="dxa" w:w="3118"/>
-            <w:shd w:val="clear" w:color="auto" w:fill="FFFFFF"/>
-          </w:tcPr>
-          <w:p>
-            <w:pPr>
-              <w:spacing w:after="40" w:before="40" w:line="252" w:lineRule="auto"/>
-            </w:pPr>
-            <w:r/>
-            <w:r>
-              <w:rPr>
-                <w:rFonts w:ascii="Calibri" w:hAnsi="Calibri" w:eastAsia="Calibri"/>
-                <w:b w:val="0"/>
-                <w:i w:val="0"/>
-                <w:color w:val="000000"/>
-                <w:sz w:val="19"/>
-              </w:rPr>
-              <w:t>0.535 seconds</w:t>
-            </w:r>
-          </w:p>
-        </w:tc>
-        <w:tc>
-          <w:tcPr>
-            <w:tcW w:type="dxa" w:w="3118"/>
-            <w:shd w:val="clear" w:color="auto" w:fill="FFFFFF"/>
-          </w:tcPr>
-          <w:p>
-            <w:pPr>
-              <w:spacing w:after="40" w:before="40" w:line="252" w:lineRule="auto"/>
-            </w:pPr>
-            <w:r/>
-            <w:r>
-              <w:rPr>
-                <w:rFonts w:ascii="Calibri" w:hAnsi="Calibri" w:eastAsia="Calibri"/>
-                <w:b w:val="0"/>
-                <w:i w:val="0"/>
-                <w:color w:val="000000"/>
-                <w:sz w:val="19"/>
-              </w:rPr>
-              <w:t>4,202</w:t>
-            </w:r>
-          </w:p>
-        </w:tc>
-      </w:tr>
-      <w:tr>
-        <w:tc>
-          <w:tcPr>
-            <w:tcW w:type="dxa" w:w="3402"/>
-            <w:shd w:val="clear" w:color="auto" w:fill="FFFFFF"/>
-          </w:tcPr>
-          <w:p>
-            <w:pPr>
-              <w:spacing w:after="40" w:before="40" w:line="252" w:lineRule="auto"/>
-            </w:pPr>
-            <w:r/>
-            <w:r>
-              <w:rPr>
-                <w:rFonts w:ascii="Calibri" w:hAnsi="Calibri" w:eastAsia="Calibri"/>
-                <w:b w:val="0"/>
-                <w:i w:val="0"/>
-                <w:color w:val="000000"/>
-                <w:sz w:val="19"/>
-              </w:rPr>
-              <w:t>20,000</w:t>
-            </w:r>
-          </w:p>
-        </w:tc>
-        <w:tc>
-          <w:tcPr>
-            <w:tcW w:type="dxa" w:w="3118"/>
-            <w:shd w:val="clear" w:color="auto" w:fill="FFFFFF"/>
-          </w:tcPr>
-          <w:p>
-            <w:pPr>
-              <w:spacing w:after="40" w:before="40" w:line="252" w:lineRule="auto"/>
-            </w:pPr>
-            <w:r/>
-            <w:r>
-              <w:rPr>
-                <w:rFonts w:ascii="Calibri" w:hAnsi="Calibri" w:eastAsia="Calibri"/>
-                <w:b w:val="0"/>
-                <w:i w:val="0"/>
-                <w:color w:val="000000"/>
-                <w:sz w:val="19"/>
-              </w:rPr>
-              <w:t>1.021 seconds</w:t>
-            </w:r>
-          </w:p>
-        </w:tc>
-        <w:tc>
-          <w:tcPr>
-            <w:tcW w:type="dxa" w:w="3118"/>
-            <w:shd w:val="clear" w:color="auto" w:fill="FFFFFF"/>
-          </w:tcPr>
-          <w:p>
-            <w:pPr>
-              <w:spacing w:after="40" w:before="40" w:line="252" w:lineRule="auto"/>
-            </w:pPr>
-            <w:r/>
-            <w:r>
-              <w:rPr>
-                <w:rFonts w:ascii="Calibri" w:hAnsi="Calibri" w:eastAsia="Calibri"/>
-                <w:b w:val="0"/>
-                <w:i w:val="0"/>
-                <w:color w:val="000000"/>
-                <w:sz w:val="19"/>
-              </w:rPr>
-              <w:t>8,090</w:t>
-            </w:r>
-          </w:p>
-        </w:tc>
-      </w:tr>
-      <w:tr>
-        <w:tc>
-          <w:tcPr>
-            <w:tcW w:type="dxa" w:w="3402"/>
-            <w:shd w:val="clear" w:color="auto" w:fill="FFFFFF"/>
-          </w:tcPr>
-          <w:p>
-            <w:pPr>
-              <w:spacing w:after="40" w:before="40" w:line="252" w:lineRule="auto"/>
-            </w:pPr>
-            <w:r/>
-            <w:r>
-              <w:rPr>
-                <w:rFonts w:ascii="Calibri" w:hAnsi="Calibri" w:eastAsia="Calibri"/>
-                <w:b w:val="0"/>
-                <w:i w:val="0"/>
-                <w:color w:val="000000"/>
-                <w:sz w:val="19"/>
-              </w:rPr>
-              <w:t>50,000</w:t>
-            </w:r>
-          </w:p>
-        </w:tc>
-        <w:tc>
-          <w:tcPr>
-            <w:tcW w:type="dxa" w:w="3118"/>
-            <w:shd w:val="clear" w:color="auto" w:fill="FFFFFF"/>
-          </w:tcPr>
-          <w:p>
-            <w:pPr>
-              <w:spacing w:after="40" w:before="40" w:line="252" w:lineRule="auto"/>
-            </w:pPr>
-            <w:r/>
-            <w:r>
-              <w:rPr>
-                <w:rFonts w:ascii="Calibri" w:hAnsi="Calibri" w:eastAsia="Calibri"/>
-                <w:b w:val="0"/>
-                <w:i w:val="0"/>
-                <w:color w:val="000000"/>
-                <w:sz w:val="19"/>
-              </w:rPr>
-              <w:t>2.493 seconds</w:t>
-            </w:r>
-          </w:p>
-        </w:tc>
-        <w:tc>
-          <w:tcPr>
-            <w:tcW w:type="dxa" w:w="3118"/>
-            <w:shd w:val="clear" w:color="auto" w:fill="FFFFFF"/>
-          </w:tcPr>
-          <w:p>
-            <w:pPr>
-              <w:spacing w:after="40" w:before="40" w:line="252" w:lineRule="auto"/>
-            </w:pPr>
-            <w:r/>
-            <w:r>
-              <w:rPr>
-                <w:rFonts w:ascii="Calibri" w:hAnsi="Calibri" w:eastAsia="Calibri"/>
-                <w:b w:val="0"/>
-                <w:i w:val="0"/>
-                <w:color w:val="000000"/>
-                <w:sz w:val="19"/>
-              </w:rPr>
-              <w:t>20,185</w:t>
-            </w:r>
-          </w:p>
-        </w:tc>
-      </w:tr>
-    </w:tbl>
-    <w:p>
-      <w:pPr>
-        <w:spacing w:after="160" w:before="0" w:line="276" w:lineRule="auto"/>
-      </w:pPr>
     </w:p>
     <w:p>
       <w:pPr>

</xml_diff>